<commit_message>
📊 Daily Chinese DB update: 2026-05-31 | 148/2000 expressions
</commit_message>
<xml_diff>
--- a/data/03_Print_PDF/Study_Note_2026-05-31.docx
+++ b/data/03_Print_PDF/Study_Note_2026-05-31.docx
@@ -33,7 +33,7 @@
           <w:sz w:val="18"/>
           <w:rFonts w:eastAsia="Microsoft YaHei" w:ascii="맑은 고딕"/>
         </w:rPr>
-        <w:t>오늘의 핵심 네이티브 표현  9개  ·  한어 병음 · 한국어 의미 · 원문 · 실전 예문 수록</w:t>
+        <w:t>오늘의 핵심 네이티브 표현  3개  ·  한어 병음 · 한국어 의미 · 원문 · 실전 예문 수록</w:t>
       </w:r>
     </w:p>
     <w:p>
@@ -60,7 +60,7 @@
           <w:sz w:val="28"/>
           <w:rFonts w:eastAsia="Microsoft YaHei" w:ascii="Microsoft YaHei"/>
         </w:rPr>
-        <w:t>失联</w:t>
+        <w:t>签订合同</w:t>
       </w:r>
       <w:r>
         <w:rPr>
@@ -71,7 +71,7 @@
           <w:sz w:val="18"/>
           <w:rFonts w:eastAsia="Microsoft YaHei" w:ascii="Calibri"/>
         </w:rPr>
-        <w:t xml:space="preserve">   [SEPARABLE VERB]</w:t>
+        <w:t xml:space="preserve">   [VERB-NOUN PHRASE]</w:t>
       </w:r>
     </w:p>
     <w:p>
@@ -97,7 +97,7 @@
           <w:sz w:val="20"/>
           <w:rFonts w:eastAsia="Microsoft YaHei" w:ascii="Calibri"/>
         </w:rPr>
-        <w:t>shīlián</w:t>
+        <w:t>qiāndìng hétong</w:t>
       </w:r>
     </w:p>
     <w:p>
@@ -123,7 +123,7 @@
           <w:sz w:val="21"/>
           <w:rFonts w:eastAsia="Microsoft YaHei" w:ascii="맑은 고딕"/>
         </w:rPr>
-        <w:t>연락이 끊기다, 실종되다.</w:t>
+        <w:t>계약을 체결하다</w:t>
       </w:r>
     </w:p>
     <w:p>
@@ -150,7 +150,7 @@
           <w:sz w:val="19"/>
           <w:rFonts w:eastAsia="Microsoft YaHei" w:ascii="Microsoft YaHei"/>
         </w:rPr>
-        <w:t>"...拒绝支付任何赔偿，甚至失联跑路。"</w:t>
+        <w:t>"...用人单位未签订劳动合同、未缴纳工伤保险..."</w:t>
       </w:r>
     </w:p>
     <w:p>
@@ -177,7 +177,7 @@
           <w:sz w:val="21"/>
           <w:rFonts w:eastAsia="Microsoft YaHei" w:ascii="Microsoft YaHei"/>
         </w:rPr>
-        <w:t>他已经好几天没来上班了，电话也打不通，好像失联了。</w:t>
+        <w:t>我们公司今天和新客户签订了一份重要的合作合同。</w:t>
       </w:r>
     </w:p>
     <w:p>
@@ -220,7 +220,7 @@
           <w:sz w:val="28"/>
           <w:rFonts w:eastAsia="Microsoft YaHei" w:ascii="Microsoft YaHei"/>
         </w:rPr>
-        <w:t>跑路</w:t>
+        <w:t>缴纳</w:t>
       </w:r>
       <w:r>
         <w:rPr>
@@ -231,7 +231,7 @@
           <w:sz w:val="18"/>
           <w:rFonts w:eastAsia="Microsoft YaHei" w:ascii="Calibri"/>
         </w:rPr>
-        <w:t xml:space="preserve">   [COLLOQUIALISM]</w:t>
+        <w:t xml:space="preserve">   [VERB]</w:t>
       </w:r>
     </w:p>
     <w:p>
@@ -257,7 +257,7 @@
           <w:sz w:val="20"/>
           <w:rFonts w:eastAsia="Microsoft YaHei" w:ascii="Calibri"/>
         </w:rPr>
-        <w:t>pǎolù</w:t>
+        <w:t>jiǎonà</w:t>
       </w:r>
     </w:p>
     <w:p>
@@ -283,7 +283,7 @@
           <w:sz w:val="21"/>
           <w:rFonts w:eastAsia="Microsoft YaHei" w:ascii="맑은 고딕"/>
         </w:rPr>
-        <w:t>도망가다, (책임을 회피하고) 잠적하다.</w:t>
+        <w:t>납부하다 (세금, 비용 등을 내다)</w:t>
       </w:r>
     </w:p>
     <w:p>
@@ -310,7 +310,7 @@
           <w:sz w:val="19"/>
           <w:rFonts w:eastAsia="Microsoft YaHei" w:ascii="Microsoft YaHei"/>
         </w:rPr>
-        <w:t>"...拒绝支付任何赔偿，甚至失联跑路。"</w:t>
+        <w:t>"...用人单位未签订劳动合同、未缴纳工伤保险..."</w:t>
       </w:r>
     </w:p>
     <w:p>
@@ -337,7 +337,7 @@
           <w:sz w:val="21"/>
           <w:rFonts w:eastAsia="Microsoft YaHei" w:ascii="Microsoft YaHei"/>
         </w:rPr>
-        <w:t>那家小公司老板欠了员工工资就跑路了，真是太不负责任了。</w:t>
+        <w:t>每个月公司都会按时为员工缴纳社会保险。</w:t>
       </w:r>
     </w:p>
     <w:p>
@@ -380,7 +380,7 @@
           <w:sz w:val="28"/>
           <w:rFonts w:eastAsia="Microsoft YaHei" w:ascii="Microsoft YaHei"/>
         </w:rPr>
-        <w:t>凭借</w:t>
+        <w:t>启动</w:t>
       </w:r>
       <w:r>
         <w:rPr>
@@ -417,7 +417,7 @@
           <w:sz w:val="20"/>
           <w:rFonts w:eastAsia="Microsoft YaHei" w:ascii="Calibri"/>
         </w:rPr>
-        <w:t>píngjiè</w:t>
+        <w:t>qǐdòng</w:t>
       </w:r>
     </w:p>
     <w:p>
@@ -443,7 +443,7 @@
           <w:sz w:val="21"/>
           <w:rFonts w:eastAsia="Microsoft YaHei" w:ascii="맑은 고딕"/>
         </w:rPr>
-        <w:t>~에 의지하여, ~을 바탕으로.</w:t>
+        <w:t>시작하다, 가동하다, 발동하다</w:t>
       </w:r>
     </w:p>
     <w:p>
@@ -470,7 +470,7 @@
           <w:sz w:val="19"/>
           <w:rFonts w:eastAsia="Microsoft YaHei" w:ascii="Microsoft YaHei"/>
         </w:rPr>
-        <w:t>"肖战、马丽分别凭借电影《得闲谨制》与《水饺皇后》，..."</w:t>
+        <w:t>"贝德美正式启动“旧物新生自然有续”环保计划..."</w:t>
       </w:r>
     </w:p>
     <w:p>
@@ -497,967 +497,7 @@
           <w:sz w:val="21"/>
           <w:rFonts w:eastAsia="Microsoft YaHei" w:ascii="Microsoft YaHei"/>
         </w:rPr>
-        <w:t>他凭借自己的努力和才华，终于在公司里获得了晋升。</w:t>
-      </w:r>
-    </w:p>
-    <w:p>
-      <w:pPr>
-        <w:spacing w:before="120" w:after="0"/>
-      </w:pPr>
-      <w:r>
-        <w:rPr>
-          <w:rFonts w:ascii="맑은 고딕" w:hAnsi="맑은 고딕"/>
-          <w:b w:val="0"/>
-          <w:i w:val="0"/>
-          <w:color w:val="C8C8C8"/>
-          <w:sz w:val="14"/>
-          <w:rFonts w:eastAsia="Microsoft YaHei" w:ascii="맑은 고딕"/>
-        </w:rPr>
-        <w:t>────────────────────────────────────────────────────────────</w:t>
-      </w:r>
-    </w:p>
-    <w:p>
-      <w:pPr>
-        <w:spacing w:before="200" w:after="40"/>
-      </w:pPr>
-      <w:r>
-        <w:rPr>
-          <w:rFonts w:ascii="맑은 고딕" w:hAnsi="맑은 고딕"/>
-          <w:b w:val="0"/>
-          <w:i w:val="0"/>
-          <w:color w:val="969696"/>
-          <w:sz w:val="20"/>
-          <w:rFonts w:eastAsia="Microsoft YaHei" w:ascii="맑은 고딕"/>
-        </w:rPr>
-        <w:t xml:space="preserve">004.  </w:t>
-      </w:r>
-      <w:r>
-        <w:rPr>
-          <w:rFonts w:ascii="Microsoft YaHei" w:hAnsi="Microsoft YaHei"/>
-          <w:b/>
-          <w:i w:val="0"/>
-          <w:color w:val="143CB4"/>
-          <w:sz w:val="28"/>
-          <w:rFonts w:eastAsia="Microsoft YaHei" w:ascii="Microsoft YaHei"/>
-        </w:rPr>
-        <w:t>融合</w:t>
-      </w:r>
-      <w:r>
-        <w:rPr>
-          <w:rFonts w:ascii="Calibri" w:hAnsi="Calibri"/>
-          <w:b w:val="0"/>
-          <w:i w:val="0"/>
-          <w:color w:val="787878"/>
-          <w:sz w:val="18"/>
-          <w:rFonts w:eastAsia="Microsoft YaHei" w:ascii="Calibri"/>
-        </w:rPr>
-        <w:t xml:space="preserve">   [VERB / NOUN]</w:t>
-      </w:r>
-    </w:p>
-    <w:p>
-      <w:pPr>
-        <w:spacing w:before="0" w:after="40"/>
-      </w:pPr>
-      <w:r>
-        <w:rPr>
-          <w:rFonts w:ascii="맑은 고딕" w:hAnsi="맑은 고딕"/>
-          <w:b w:val="0"/>
-          <w:i w:val="0"/>
-          <w:sz w:val="20"/>
-          <w:rFonts w:eastAsia="Microsoft YaHei" w:ascii="맑은 고딕"/>
-        </w:rPr>
-        <w:t xml:space="preserve">🔊 </w:t>
-      </w:r>
-      <w:r>
-        <w:rPr>
-          <w:rFonts w:ascii="Calibri" w:hAnsi="Calibri"/>
-          <w:b w:val="0"/>
-          <w:i/>
-          <w:color w:val="505050"/>
-          <w:sz w:val="20"/>
-          <w:rFonts w:eastAsia="Microsoft YaHei" w:ascii="Calibri"/>
-        </w:rPr>
-        <w:t>rónghé</w:t>
-      </w:r>
-    </w:p>
-    <w:p>
-      <w:pPr>
-        <w:spacing w:before="0" w:after="60"/>
-      </w:pPr>
-      <w:r>
-        <w:rPr>
-          <w:rFonts w:ascii="맑은 고딕" w:hAnsi="맑은 고딕"/>
-          <w:b/>
-          <w:i w:val="0"/>
-          <w:color w:val="282828"/>
-          <w:sz w:val="20"/>
-          <w:rFonts w:eastAsia="Microsoft YaHei" w:ascii="맑은 고딕"/>
-        </w:rPr>
-        <w:t xml:space="preserve">💡 의미  </w:t>
-      </w:r>
-      <w:r>
-        <w:rPr>
-          <w:rFonts w:ascii="맑은 고딕" w:hAnsi="맑은 고딕"/>
-          <w:b w:val="0"/>
-          <w:i w:val="0"/>
-          <w:sz w:val="21"/>
-          <w:rFonts w:eastAsia="Microsoft YaHei" w:ascii="맑은 고딕"/>
-        </w:rPr>
-        <w:t>융합하다, 통합하다, 융합.</w:t>
-      </w:r>
-    </w:p>
-    <w:p>
-      <w:pPr>
-        <w:spacing w:before="0" w:after="40"/>
-      </w:pPr>
-      <w:r>
-        <w:rPr>
-          <w:rFonts w:ascii="맑은 고딕" w:hAnsi="맑은 고딕"/>
-          <w:b/>
-          <w:i w:val="0"/>
-          <w:color w:val="646464"/>
-          <w:sz w:val="19"/>
-          <w:rFonts w:eastAsia="Microsoft YaHei" w:ascii="맑은 고딕"/>
-        </w:rPr>
-        <w:t xml:space="preserve">📌 원문  </w:t>
-      </w:r>
-      <w:r>
-        <w:rPr>
-          <w:rFonts w:ascii="Microsoft YaHei" w:hAnsi="Microsoft YaHei"/>
-          <w:b w:val="0"/>
-          <w:i/>
-          <w:color w:val="5A5A5A"/>
-          <w:sz w:val="19"/>
-          <w:rFonts w:eastAsia="Microsoft YaHei" w:ascii="Microsoft YaHei"/>
-        </w:rPr>
-        <w:t>"当百年遗产“邂逅”文旅潮流 工商文旅融合解锁跨界“..."</w:t>
-      </w:r>
-    </w:p>
-    <w:p>
-      <w:pPr>
-        <w:spacing w:before="40" w:after="40"/>
-      </w:pPr>
-      <w:r>
-        <w:rPr>
-          <w:rFonts w:ascii="맑은 고딕" w:hAnsi="맑은 고딕"/>
-          <w:b/>
-          <w:i w:val="0"/>
-          <w:color w:val="007850"/>
-          <w:sz w:val="20"/>
-          <w:rFonts w:eastAsia="Microsoft YaHei" w:ascii="맑은 고딕"/>
-        </w:rPr>
-        <w:t xml:space="preserve">✏️ 예문  </w:t>
-      </w:r>
-      <w:r>
-        <w:rPr>
-          <w:rFonts w:ascii="Microsoft YaHei" w:hAnsi="Microsoft YaHei"/>
-          <w:b/>
-          <w:i w:val="0"/>
-          <w:color w:val="00643C"/>
-          <w:sz w:val="21"/>
-          <w:rFonts w:eastAsia="Microsoft YaHei" w:ascii="Microsoft YaHei"/>
-        </w:rPr>
-        <w:t>现代科技与传统文化如何更好地融合，是我们需要思考的问题。</w:t>
-      </w:r>
-    </w:p>
-    <w:p>
-      <w:pPr>
-        <w:spacing w:before="120" w:after="0"/>
-      </w:pPr>
-      <w:r>
-        <w:rPr>
-          <w:rFonts w:ascii="맑은 고딕" w:hAnsi="맑은 고딕"/>
-          <w:b w:val="0"/>
-          <w:i w:val="0"/>
-          <w:color w:val="C8C8C8"/>
-          <w:sz w:val="14"/>
-          <w:rFonts w:eastAsia="Microsoft YaHei" w:ascii="맑은 고딕"/>
-        </w:rPr>
-        <w:t>────────────────────────────────────────────────────────────</w:t>
-      </w:r>
-    </w:p>
-    <w:p>
-      <w:pPr>
-        <w:spacing w:before="200" w:after="40"/>
-      </w:pPr>
-      <w:r>
-        <w:rPr>
-          <w:rFonts w:ascii="맑은 고딕" w:hAnsi="맑은 고딕"/>
-          <w:b w:val="0"/>
-          <w:i w:val="0"/>
-          <w:color w:val="969696"/>
-          <w:sz w:val="20"/>
-          <w:rFonts w:eastAsia="Microsoft YaHei" w:ascii="맑은 고딕"/>
-        </w:rPr>
-        <w:t xml:space="preserve">005.  </w:t>
-      </w:r>
-      <w:r>
-        <w:rPr>
-          <w:rFonts w:ascii="Microsoft YaHei" w:hAnsi="Microsoft YaHei"/>
-          <w:b/>
-          <w:i w:val="0"/>
-          <w:color w:val="143CB4"/>
-          <w:sz w:val="28"/>
-          <w:rFonts w:eastAsia="Microsoft YaHei" w:ascii="Microsoft YaHei"/>
-        </w:rPr>
-        <w:t>出炉</w:t>
-      </w:r>
-      <w:r>
-        <w:rPr>
-          <w:rFonts w:ascii="Calibri" w:hAnsi="Calibri"/>
-          <w:b w:val="0"/>
-          <w:i w:val="0"/>
-          <w:color w:val="787878"/>
-          <w:sz w:val="18"/>
-          <w:rFonts w:eastAsia="Microsoft YaHei" w:ascii="Calibri"/>
-        </w:rPr>
-        <w:t xml:space="preserve">   [COLLOQUIALISM]</w:t>
-      </w:r>
-    </w:p>
-    <w:p>
-      <w:pPr>
-        <w:spacing w:before="0" w:after="40"/>
-      </w:pPr>
-      <w:r>
-        <w:rPr>
-          <w:rFonts w:ascii="맑은 고딕" w:hAnsi="맑은 고딕"/>
-          <w:b w:val="0"/>
-          <w:i w:val="0"/>
-          <w:sz w:val="20"/>
-          <w:rFonts w:eastAsia="Microsoft YaHei" w:ascii="맑은 고딕"/>
-        </w:rPr>
-        <w:t xml:space="preserve">🔊 </w:t>
-      </w:r>
-      <w:r>
-        <w:rPr>
-          <w:rFonts w:ascii="Calibri" w:hAnsi="Calibri"/>
-          <w:b w:val="0"/>
-          <w:i/>
-          <w:color w:val="505050"/>
-          <w:sz w:val="20"/>
-          <w:rFonts w:eastAsia="Microsoft YaHei" w:ascii="Calibri"/>
-        </w:rPr>
-        <w:t>chū lú</w:t>
-      </w:r>
-    </w:p>
-    <w:p>
-      <w:pPr>
-        <w:spacing w:before="0" w:after="60"/>
-      </w:pPr>
-      <w:r>
-        <w:rPr>
-          <w:rFonts w:ascii="맑은 고딕" w:hAnsi="맑은 고딕"/>
-          <w:b/>
-          <w:i w:val="0"/>
-          <w:color w:val="282828"/>
-          <w:sz w:val="20"/>
-          <w:rFonts w:eastAsia="Microsoft YaHei" w:ascii="맑은 고딕"/>
-        </w:rPr>
-        <w:t xml:space="preserve">💡 의미  </w:t>
-      </w:r>
-      <w:r>
-        <w:rPr>
-          <w:rFonts w:ascii="맑은 고딕" w:hAnsi="맑은 고딕"/>
-          <w:b w:val="0"/>
-          <w:i w:val="0"/>
-          <w:sz w:val="21"/>
-          <w:rFonts w:eastAsia="Microsoft YaHei" w:ascii="맑은 고딕"/>
-        </w:rPr>
-        <w:t>(결과, 제품 등이) 나오다, 발표되다</w:t>
-      </w:r>
-    </w:p>
-    <w:p>
-      <w:pPr>
-        <w:spacing w:before="0" w:after="40"/>
-      </w:pPr>
-      <w:r>
-        <w:rPr>
-          <w:rFonts w:ascii="맑은 고딕" w:hAnsi="맑은 고딕"/>
-          <w:b/>
-          <w:i w:val="0"/>
-          <w:color w:val="646464"/>
-          <w:sz w:val="19"/>
-          <w:rFonts w:eastAsia="Microsoft YaHei" w:ascii="맑은 고딕"/>
-        </w:rPr>
-        <w:t xml:space="preserve">📌 원문  </w:t>
-      </w:r>
-      <w:r>
-        <w:rPr>
-          <w:rFonts w:ascii="Microsoft YaHei" w:hAnsi="Microsoft YaHei"/>
-          <w:b w:val="0"/>
-          <w:i/>
-          <w:color w:val="5A5A5A"/>
-          <w:sz w:val="19"/>
-          <w:rFonts w:eastAsia="Microsoft YaHei" w:ascii="Microsoft YaHei"/>
-        </w:rPr>
-        <w:t>"高考成绩出炉"</w:t>
-      </w:r>
-    </w:p>
-    <w:p>
-      <w:pPr>
-        <w:spacing w:before="40" w:after="40"/>
-      </w:pPr>
-      <w:r>
-        <w:rPr>
-          <w:rFonts w:ascii="맑은 고딕" w:hAnsi="맑은 고딕"/>
-          <w:b/>
-          <w:i w:val="0"/>
-          <w:color w:val="007850"/>
-          <w:sz w:val="20"/>
-          <w:rFonts w:eastAsia="Microsoft YaHei" w:ascii="맑은 고딕"/>
-        </w:rPr>
-        <w:t xml:space="preserve">✏️ 예문  </w:t>
-      </w:r>
-      <w:r>
-        <w:rPr>
-          <w:rFonts w:ascii="Microsoft YaHei" w:hAnsi="Microsoft YaHei"/>
-          <w:b/>
-          <w:i w:val="0"/>
-          <w:color w:val="00643C"/>
-          <w:sz w:val="21"/>
-          <w:rFonts w:eastAsia="Microsoft YaHei" w:ascii="Microsoft YaHei"/>
-        </w:rPr>
-        <w:t>经过几个月的紧张筹备，我们公司的新产品终于出炉了。</w:t>
-      </w:r>
-    </w:p>
-    <w:p>
-      <w:pPr>
-        <w:spacing w:before="120" w:after="0"/>
-      </w:pPr>
-      <w:r>
-        <w:rPr>
-          <w:rFonts w:ascii="맑은 고딕" w:hAnsi="맑은 고딕"/>
-          <w:b w:val="0"/>
-          <w:i w:val="0"/>
-          <w:color w:val="C8C8C8"/>
-          <w:sz w:val="14"/>
-          <w:rFonts w:eastAsia="Microsoft YaHei" w:ascii="맑은 고딕"/>
-        </w:rPr>
-        <w:t>────────────────────────────────────────────────────────────</w:t>
-      </w:r>
-    </w:p>
-    <w:p>
-      <w:pPr>
-        <w:spacing w:before="200" w:after="40"/>
-      </w:pPr>
-      <w:r>
-        <w:rPr>
-          <w:rFonts w:ascii="맑은 고딕" w:hAnsi="맑은 고딕"/>
-          <w:b w:val="0"/>
-          <w:i w:val="0"/>
-          <w:color w:val="969696"/>
-          <w:sz w:val="20"/>
-          <w:rFonts w:eastAsia="Microsoft YaHei" w:ascii="맑은 고딕"/>
-        </w:rPr>
-        <w:t xml:space="preserve">006.  </w:t>
-      </w:r>
-      <w:r>
-        <w:rPr>
-          <w:rFonts w:ascii="Microsoft YaHei" w:hAnsi="Microsoft YaHei"/>
-          <w:b/>
-          <w:i w:val="0"/>
-          <w:color w:val="143CB4"/>
-          <w:sz w:val="28"/>
-          <w:rFonts w:eastAsia="Microsoft YaHei" w:ascii="Microsoft YaHei"/>
-        </w:rPr>
-        <w:t>致敬</w:t>
-      </w:r>
-      <w:r>
-        <w:rPr>
-          <w:rFonts w:ascii="Calibri" w:hAnsi="Calibri"/>
-          <w:b w:val="0"/>
-          <w:i w:val="0"/>
-          <w:color w:val="787878"/>
-          <w:sz w:val="18"/>
-          <w:rFonts w:eastAsia="Microsoft YaHei" w:ascii="Calibri"/>
-        </w:rPr>
-        <w:t xml:space="preserve">   [VERB]</w:t>
-      </w:r>
-    </w:p>
-    <w:p>
-      <w:pPr>
-        <w:spacing w:before="0" w:after="40"/>
-      </w:pPr>
-      <w:r>
-        <w:rPr>
-          <w:rFonts w:ascii="맑은 고딕" w:hAnsi="맑은 고딕"/>
-          <w:b w:val="0"/>
-          <w:i w:val="0"/>
-          <w:sz w:val="20"/>
-          <w:rFonts w:eastAsia="Microsoft YaHei" w:ascii="맑은 고딕"/>
-        </w:rPr>
-        <w:t xml:space="preserve">🔊 </w:t>
-      </w:r>
-      <w:r>
-        <w:rPr>
-          <w:rFonts w:ascii="Calibri" w:hAnsi="Calibri"/>
-          <w:b w:val="0"/>
-          <w:i/>
-          <w:color w:val="505050"/>
-          <w:sz w:val="20"/>
-          <w:rFonts w:eastAsia="Microsoft YaHei" w:ascii="Calibri"/>
-        </w:rPr>
-        <w:t>zhì jìng</w:t>
-      </w:r>
-    </w:p>
-    <w:p>
-      <w:pPr>
-        <w:spacing w:before="0" w:after="60"/>
-      </w:pPr>
-      <w:r>
-        <w:rPr>
-          <w:rFonts w:ascii="맑은 고딕" w:hAnsi="맑은 고딕"/>
-          <w:b/>
-          <w:i w:val="0"/>
-          <w:color w:val="282828"/>
-          <w:sz w:val="20"/>
-          <w:rFonts w:eastAsia="Microsoft YaHei" w:ascii="맑은 고딕"/>
-        </w:rPr>
-        <w:t xml:space="preserve">💡 의미  </w:t>
-      </w:r>
-      <w:r>
-        <w:rPr>
-          <w:rFonts w:ascii="맑은 고딕" w:hAnsi="맑은 고딕"/>
-          <w:b w:val="0"/>
-          <w:i w:val="0"/>
-          <w:sz w:val="21"/>
-          <w:rFonts w:eastAsia="Microsoft YaHei" w:ascii="맑은 고딕"/>
-        </w:rPr>
-        <w:t>경의를 표하다, 존경을 표하다</w:t>
-      </w:r>
-    </w:p>
-    <w:p>
-      <w:pPr>
-        <w:spacing w:before="0" w:after="40"/>
-      </w:pPr>
-      <w:r>
-        <w:rPr>
-          <w:rFonts w:ascii="맑은 고딕" w:hAnsi="맑은 고딕"/>
-          <w:b/>
-          <w:i w:val="0"/>
-          <w:color w:val="646464"/>
-          <w:sz w:val="19"/>
-          <w:rFonts w:eastAsia="Microsoft YaHei" w:ascii="맑은 고딕"/>
-        </w:rPr>
-        <w:t xml:space="preserve">📌 원문  </w:t>
-      </w:r>
-      <w:r>
-        <w:rPr>
-          <w:rFonts w:ascii="Microsoft YaHei" w:hAnsi="Microsoft YaHei"/>
-          <w:b w:val="0"/>
-          <w:i/>
-          <w:color w:val="5A5A5A"/>
-          <w:sz w:val="19"/>
-          <w:rFonts w:eastAsia="Microsoft YaHei" w:ascii="Microsoft YaHei"/>
-        </w:rPr>
-        <w:t>"致敬劳动者"</w:t>
-      </w:r>
-    </w:p>
-    <w:p>
-      <w:pPr>
-        <w:spacing w:before="40" w:after="40"/>
-      </w:pPr>
-      <w:r>
-        <w:rPr>
-          <w:rFonts w:ascii="맑은 고딕" w:hAnsi="맑은 고딕"/>
-          <w:b/>
-          <w:i w:val="0"/>
-          <w:color w:val="007850"/>
-          <w:sz w:val="20"/>
-          <w:rFonts w:eastAsia="Microsoft YaHei" w:ascii="맑은 고딕"/>
-        </w:rPr>
-        <w:t xml:space="preserve">✏️ 예문  </w:t>
-      </w:r>
-      <w:r>
-        <w:rPr>
-          <w:rFonts w:ascii="Microsoft YaHei" w:hAnsi="Microsoft YaHei"/>
-          <w:b/>
-          <w:i w:val="0"/>
-          <w:color w:val="00643C"/>
-          <w:sz w:val="21"/>
-          <w:rFonts w:eastAsia="Microsoft YaHei" w:ascii="Microsoft YaHei"/>
-        </w:rPr>
-        <w:t>在这个特殊的日子里，我们向所有医护人员致敬。</w:t>
-      </w:r>
-    </w:p>
-    <w:p>
-      <w:pPr>
-        <w:spacing w:before="120" w:after="0"/>
-      </w:pPr>
-      <w:r>
-        <w:rPr>
-          <w:rFonts w:ascii="맑은 고딕" w:hAnsi="맑은 고딕"/>
-          <w:b w:val="0"/>
-          <w:i w:val="0"/>
-          <w:color w:val="C8C8C8"/>
-          <w:sz w:val="14"/>
-          <w:rFonts w:eastAsia="Microsoft YaHei" w:ascii="맑은 고딕"/>
-        </w:rPr>
-        <w:t>────────────────────────────────────────────────────────────</w:t>
-      </w:r>
-    </w:p>
-    <w:p>
-      <w:pPr>
-        <w:spacing w:before="200" w:after="40"/>
-      </w:pPr>
-      <w:r>
-        <w:rPr>
-          <w:rFonts w:ascii="맑은 고딕" w:hAnsi="맑은 고딕"/>
-          <w:b w:val="0"/>
-          <w:i w:val="0"/>
-          <w:color w:val="969696"/>
-          <w:sz w:val="20"/>
-          <w:rFonts w:eastAsia="Microsoft YaHei" w:ascii="맑은 고딕"/>
-        </w:rPr>
-        <w:t xml:space="preserve">007.  </w:t>
-      </w:r>
-      <w:r>
-        <w:rPr>
-          <w:rFonts w:ascii="Microsoft YaHei" w:hAnsi="Microsoft YaHei"/>
-          <w:b/>
-          <w:i w:val="0"/>
-          <w:color w:val="143CB4"/>
-          <w:sz w:val="28"/>
-          <w:rFonts w:eastAsia="Microsoft YaHei" w:ascii="Microsoft YaHei"/>
-        </w:rPr>
-        <w:t>聚焦</w:t>
-      </w:r>
-      <w:r>
-        <w:rPr>
-          <w:rFonts w:ascii="Calibri" w:hAnsi="Calibri"/>
-          <w:b w:val="0"/>
-          <w:i w:val="0"/>
-          <w:color w:val="787878"/>
-          <w:sz w:val="18"/>
-          <w:rFonts w:eastAsia="Microsoft YaHei" w:ascii="Calibri"/>
-        </w:rPr>
-        <w:t xml:space="preserve">   [VERB]</w:t>
-      </w:r>
-    </w:p>
-    <w:p>
-      <w:pPr>
-        <w:spacing w:before="0" w:after="40"/>
-      </w:pPr>
-      <w:r>
-        <w:rPr>
-          <w:rFonts w:ascii="맑은 고딕" w:hAnsi="맑은 고딕"/>
-          <w:b w:val="0"/>
-          <w:i w:val="0"/>
-          <w:sz w:val="20"/>
-          <w:rFonts w:eastAsia="Microsoft YaHei" w:ascii="맑은 고딕"/>
-        </w:rPr>
-        <w:t xml:space="preserve">🔊 </w:t>
-      </w:r>
-      <w:r>
-        <w:rPr>
-          <w:rFonts w:ascii="Calibri" w:hAnsi="Calibri"/>
-          <w:b w:val="0"/>
-          <w:i/>
-          <w:color w:val="505050"/>
-          <w:sz w:val="20"/>
-          <w:rFonts w:eastAsia="Microsoft YaHei" w:ascii="Calibri"/>
-        </w:rPr>
-        <w:t>jù jiāo</w:t>
-      </w:r>
-    </w:p>
-    <w:p>
-      <w:pPr>
-        <w:spacing w:before="0" w:after="60"/>
-      </w:pPr>
-      <w:r>
-        <w:rPr>
-          <w:rFonts w:ascii="맑은 고딕" w:hAnsi="맑은 고딕"/>
-          <w:b/>
-          <w:i w:val="0"/>
-          <w:color w:val="282828"/>
-          <w:sz w:val="20"/>
-          <w:rFonts w:eastAsia="Microsoft YaHei" w:ascii="맑은 고딕"/>
-        </w:rPr>
-        <w:t xml:space="preserve">💡 의미  </w:t>
-      </w:r>
-      <w:r>
-        <w:rPr>
-          <w:rFonts w:ascii="맑은 고딕" w:hAnsi="맑은 고딕"/>
-          <w:b w:val="0"/>
-          <w:i w:val="0"/>
-          <w:sz w:val="21"/>
-          <w:rFonts w:eastAsia="Microsoft YaHei" w:ascii="맑은 고딕"/>
-        </w:rPr>
-        <w:t>초점을 맞추다, 집중하다</w:t>
-      </w:r>
-    </w:p>
-    <w:p>
-      <w:pPr>
-        <w:spacing w:before="0" w:after="40"/>
-      </w:pPr>
-      <w:r>
-        <w:rPr>
-          <w:rFonts w:ascii="맑은 고딕" w:hAnsi="맑은 고딕"/>
-          <w:b/>
-          <w:i w:val="0"/>
-          <w:color w:val="646464"/>
-          <w:sz w:val="19"/>
-          <w:rFonts w:eastAsia="Microsoft YaHei" w:ascii="맑은 고딕"/>
-        </w:rPr>
-        <w:t xml:space="preserve">📌 원문  </w:t>
-      </w:r>
-      <w:r>
-        <w:rPr>
-          <w:rFonts w:ascii="Microsoft YaHei" w:hAnsi="Microsoft YaHei"/>
-          <w:b w:val="0"/>
-          <w:i/>
-          <w:color w:val="5A5A5A"/>
-          <w:sz w:val="19"/>
-          <w:rFonts w:eastAsia="Microsoft YaHei" w:ascii="Microsoft YaHei"/>
-        </w:rPr>
-        <w:t>"聚焦赣江流域水生..."</w:t>
-      </w:r>
-    </w:p>
-    <w:p>
-      <w:pPr>
-        <w:spacing w:before="40" w:after="40"/>
-      </w:pPr>
-      <w:r>
-        <w:rPr>
-          <w:rFonts w:ascii="맑은 고딕" w:hAnsi="맑은 고딕"/>
-          <w:b/>
-          <w:i w:val="0"/>
-          <w:color w:val="007850"/>
-          <w:sz w:val="20"/>
-          <w:rFonts w:eastAsia="Microsoft YaHei" w:ascii="맑은 고딕"/>
-        </w:rPr>
-        <w:t xml:space="preserve">✏️ 예문  </w:t>
-      </w:r>
-      <w:r>
-        <w:rPr>
-          <w:rFonts w:ascii="Microsoft YaHei" w:hAnsi="Microsoft YaHei"/>
-          <w:b/>
-          <w:i w:val="0"/>
-          <w:color w:val="00643C"/>
-          <w:sz w:val="21"/>
-          <w:rFonts w:eastAsia="Microsoft YaHei" w:ascii="Microsoft YaHei"/>
-        </w:rPr>
-        <w:t>下周的会议将聚焦如何提高市场份额的问题，请大家提前做好准备。</w:t>
-      </w:r>
-    </w:p>
-    <w:p>
-      <w:pPr>
-        <w:spacing w:before="120" w:after="0"/>
-      </w:pPr>
-      <w:r>
-        <w:rPr>
-          <w:rFonts w:ascii="맑은 고딕" w:hAnsi="맑은 고딕"/>
-          <w:b w:val="0"/>
-          <w:i w:val="0"/>
-          <w:color w:val="C8C8C8"/>
-          <w:sz w:val="14"/>
-          <w:rFonts w:eastAsia="Microsoft YaHei" w:ascii="맑은 고딕"/>
-        </w:rPr>
-        <w:t>────────────────────────────────────────────────────────────</w:t>
-      </w:r>
-    </w:p>
-    <w:p>
-      <w:pPr>
-        <w:spacing w:before="200" w:after="40"/>
-      </w:pPr>
-      <w:r>
-        <w:rPr>
-          <w:rFonts w:ascii="맑은 고딕" w:hAnsi="맑은 고딕"/>
-          <w:b w:val="0"/>
-          <w:i w:val="0"/>
-          <w:color w:val="969696"/>
-          <w:sz w:val="20"/>
-          <w:rFonts w:eastAsia="Microsoft YaHei" w:ascii="맑은 고딕"/>
-        </w:rPr>
-        <w:t xml:space="preserve">008.  </w:t>
-      </w:r>
-      <w:r>
-        <w:rPr>
-          <w:rFonts w:ascii="Microsoft YaHei" w:hAnsi="Microsoft YaHei"/>
-          <w:b/>
-          <w:i w:val="0"/>
-          <w:color w:val="143CB4"/>
-          <w:sz w:val="28"/>
-          <w:rFonts w:eastAsia="Microsoft YaHei" w:ascii="Microsoft YaHei"/>
-        </w:rPr>
-        <w:t>服役</w:t>
-      </w:r>
-      <w:r>
-        <w:rPr>
-          <w:rFonts w:ascii="Calibri" w:hAnsi="Calibri"/>
-          <w:b w:val="0"/>
-          <w:i w:val="0"/>
-          <w:color w:val="787878"/>
-          <w:sz w:val="18"/>
-          <w:rFonts w:eastAsia="Microsoft YaHei" w:ascii="Calibri"/>
-        </w:rPr>
-        <w:t xml:space="preserve">   [SEPARABLE VERB]</w:t>
-      </w:r>
-    </w:p>
-    <w:p>
-      <w:pPr>
-        <w:spacing w:before="0" w:after="40"/>
-      </w:pPr>
-      <w:r>
-        <w:rPr>
-          <w:rFonts w:ascii="맑은 고딕" w:hAnsi="맑은 고딕"/>
-          <w:b w:val="0"/>
-          <w:i w:val="0"/>
-          <w:sz w:val="20"/>
-          <w:rFonts w:eastAsia="Microsoft YaHei" w:ascii="맑은 고딕"/>
-        </w:rPr>
-        <w:t xml:space="preserve">🔊 </w:t>
-      </w:r>
-      <w:r>
-        <w:rPr>
-          <w:rFonts w:ascii="Calibri" w:hAnsi="Calibri"/>
-          <w:b w:val="0"/>
-          <w:i/>
-          <w:color w:val="505050"/>
-          <w:sz w:val="20"/>
-          <w:rFonts w:eastAsia="Microsoft YaHei" w:ascii="Calibri"/>
-        </w:rPr>
-        <w:t>fúyì</w:t>
-      </w:r>
-    </w:p>
-    <w:p>
-      <w:pPr>
-        <w:spacing w:before="0" w:after="60"/>
-      </w:pPr>
-      <w:r>
-        <w:rPr>
-          <w:rFonts w:ascii="맑은 고딕" w:hAnsi="맑은 고딕"/>
-          <w:b/>
-          <w:i w:val="0"/>
-          <w:color w:val="282828"/>
-          <w:sz w:val="20"/>
-          <w:rFonts w:eastAsia="Microsoft YaHei" w:ascii="맑은 고딕"/>
-        </w:rPr>
-        <w:t xml:space="preserve">💡 의미  </w:t>
-      </w:r>
-      <w:r>
-        <w:rPr>
-          <w:rFonts w:ascii="맑은 고딕" w:hAnsi="맑은 고딕"/>
-          <w:b w:val="0"/>
-          <w:i w:val="0"/>
-          <w:sz w:val="21"/>
-          <w:rFonts w:eastAsia="Microsoft YaHei" w:ascii="맑은 고딕"/>
-        </w:rPr>
-        <w:t>복무하다, 근무하다, (기계 등이) 운행되다</w:t>
-      </w:r>
-    </w:p>
-    <w:p>
-      <w:pPr>
-        <w:spacing w:before="0" w:after="40"/>
-      </w:pPr>
-      <w:r>
-        <w:rPr>
-          <w:rFonts w:ascii="맑은 고딕" w:hAnsi="맑은 고딕"/>
-          <w:b/>
-          <w:i w:val="0"/>
-          <w:color w:val="646464"/>
-          <w:sz w:val="19"/>
-          <w:rFonts w:eastAsia="Microsoft YaHei" w:ascii="맑은 고딕"/>
-        </w:rPr>
-        <w:t xml:space="preserve">📌 원문  </w:t>
-      </w:r>
-      <w:r>
-        <w:rPr>
-          <w:rFonts w:ascii="Microsoft YaHei" w:hAnsi="Microsoft YaHei"/>
-          <w:b w:val="0"/>
-          <w:i/>
-          <w:color w:val="5A5A5A"/>
-          <w:sz w:val="19"/>
-          <w:rFonts w:eastAsia="Microsoft YaHei" w:ascii="Microsoft YaHei"/>
-        </w:rPr>
-        <w:t>"北京地铁一号线“服役”20多年的老列车在逐渐“告别..."</w:t>
-      </w:r>
-    </w:p>
-    <w:p>
-      <w:pPr>
-        <w:spacing w:before="40" w:after="40"/>
-      </w:pPr>
-      <w:r>
-        <w:rPr>
-          <w:rFonts w:ascii="맑은 고딕" w:hAnsi="맑은 고딕"/>
-          <w:b/>
-          <w:i w:val="0"/>
-          <w:color w:val="007850"/>
-          <w:sz w:val="20"/>
-          <w:rFonts w:eastAsia="Microsoft YaHei" w:ascii="맑은 고딕"/>
-        </w:rPr>
-        <w:t xml:space="preserve">✏️ 예문  </w:t>
-      </w:r>
-      <w:r>
-        <w:rPr>
-          <w:rFonts w:ascii="Microsoft YaHei" w:hAnsi="Microsoft YaHei"/>
-          <w:b/>
-          <w:i w:val="0"/>
-          <w:color w:val="00643C"/>
-          <w:sz w:val="21"/>
-          <w:rFonts w:eastAsia="Microsoft YaHei" w:ascii="Microsoft YaHei"/>
-        </w:rPr>
-        <w:t>这台服务器已经服役五年了，是时候考虑更新换代了。</w:t>
-      </w:r>
-    </w:p>
-    <w:p>
-      <w:pPr>
-        <w:spacing w:before="120" w:after="0"/>
-      </w:pPr>
-      <w:r>
-        <w:rPr>
-          <w:rFonts w:ascii="맑은 고딕" w:hAnsi="맑은 고딕"/>
-          <w:b w:val="0"/>
-          <w:i w:val="0"/>
-          <w:color w:val="C8C8C8"/>
-          <w:sz w:val="14"/>
-          <w:rFonts w:eastAsia="Microsoft YaHei" w:ascii="맑은 고딕"/>
-        </w:rPr>
-        <w:t>────────────────────────────────────────────────────────────</w:t>
-      </w:r>
-    </w:p>
-    <w:p>
-      <w:pPr>
-        <w:spacing w:before="200" w:after="40"/>
-      </w:pPr>
-      <w:r>
-        <w:rPr>
-          <w:rFonts w:ascii="맑은 고딕" w:hAnsi="맑은 고딕"/>
-          <w:b w:val="0"/>
-          <w:i w:val="0"/>
-          <w:color w:val="969696"/>
-          <w:sz w:val="20"/>
-          <w:rFonts w:eastAsia="Microsoft YaHei" w:ascii="맑은 고딕"/>
-        </w:rPr>
-        <w:t xml:space="preserve">009.  </w:t>
-      </w:r>
-      <w:r>
-        <w:rPr>
-          <w:rFonts w:ascii="Microsoft YaHei" w:hAnsi="Microsoft YaHei"/>
-          <w:b/>
-          <w:i w:val="0"/>
-          <w:color w:val="143CB4"/>
-          <w:sz w:val="28"/>
-          <w:rFonts w:eastAsia="Microsoft YaHei" w:ascii="Microsoft YaHei"/>
-        </w:rPr>
-        <w:t>咨询</w:t>
-      </w:r>
-      <w:r>
-        <w:rPr>
-          <w:rFonts w:ascii="Calibri" w:hAnsi="Calibri"/>
-          <w:b w:val="0"/>
-          <w:i w:val="0"/>
-          <w:color w:val="787878"/>
-          <w:sz w:val="18"/>
-          <w:rFonts w:eastAsia="Microsoft YaHei" w:ascii="Calibri"/>
-        </w:rPr>
-        <w:t xml:space="preserve">   [VERB]</w:t>
-      </w:r>
-    </w:p>
-    <w:p>
-      <w:pPr>
-        <w:spacing w:before="0" w:after="40"/>
-      </w:pPr>
-      <w:r>
-        <w:rPr>
-          <w:rFonts w:ascii="맑은 고딕" w:hAnsi="맑은 고딕"/>
-          <w:b w:val="0"/>
-          <w:i w:val="0"/>
-          <w:sz w:val="20"/>
-          <w:rFonts w:eastAsia="Microsoft YaHei" w:ascii="맑은 고딕"/>
-        </w:rPr>
-        <w:t xml:space="preserve">🔊 </w:t>
-      </w:r>
-      <w:r>
-        <w:rPr>
-          <w:rFonts w:ascii="Calibri" w:hAnsi="Calibri"/>
-          <w:b w:val="0"/>
-          <w:i/>
-          <w:color w:val="505050"/>
-          <w:sz w:val="20"/>
-          <w:rFonts w:eastAsia="Microsoft YaHei" w:ascii="Calibri"/>
-        </w:rPr>
-        <w:t>zīxún</w:t>
-      </w:r>
-    </w:p>
-    <w:p>
-      <w:pPr>
-        <w:spacing w:before="0" w:after="60"/>
-      </w:pPr>
-      <w:r>
-        <w:rPr>
-          <w:rFonts w:ascii="맑은 고딕" w:hAnsi="맑은 고딕"/>
-          <w:b/>
-          <w:i w:val="0"/>
-          <w:color w:val="282828"/>
-          <w:sz w:val="20"/>
-          <w:rFonts w:eastAsia="Microsoft YaHei" w:ascii="맑은 고딕"/>
-        </w:rPr>
-        <w:t xml:space="preserve">💡 의미  </w:t>
-      </w:r>
-      <w:r>
-        <w:rPr>
-          <w:rFonts w:ascii="맑은 고딕" w:hAnsi="맑은 고딕"/>
-          <w:b w:val="0"/>
-          <w:i w:val="0"/>
-          <w:sz w:val="21"/>
-          <w:rFonts w:eastAsia="Microsoft YaHei" w:ascii="맑은 고딕"/>
-        </w:rPr>
-        <w:t>상담하다, 문의하다</w:t>
-      </w:r>
-    </w:p>
-    <w:p>
-      <w:pPr>
-        <w:spacing w:before="0" w:after="40"/>
-      </w:pPr>
-      <w:r>
-        <w:rPr>
-          <w:rFonts w:ascii="맑은 고딕" w:hAnsi="맑은 고딕"/>
-          <w:b/>
-          <w:i w:val="0"/>
-          <w:color w:val="646464"/>
-          <w:sz w:val="19"/>
-          <w:rFonts w:eastAsia="Microsoft YaHei" w:ascii="맑은 고딕"/>
-        </w:rPr>
-        <w:t xml:space="preserve">📌 원문  </w:t>
-      </w:r>
-      <w:r>
-        <w:rPr>
-          <w:rFonts w:ascii="Microsoft YaHei" w:hAnsi="Microsoft YaHei"/>
-          <w:b w:val="0"/>
-          <w:i/>
-          <w:color w:val="5A5A5A"/>
-          <w:sz w:val="19"/>
-          <w:rFonts w:eastAsia="Microsoft YaHei" w:ascii="Microsoft YaHei"/>
-        </w:rPr>
-        <w:t>"我曾直接参与学校的心理健康咨询工作。"</w:t>
-      </w:r>
-    </w:p>
-    <w:p>
-      <w:pPr>
-        <w:spacing w:before="40" w:after="40"/>
-      </w:pPr>
-      <w:r>
-        <w:rPr>
-          <w:rFonts w:ascii="맑은 고딕" w:hAnsi="맑은 고딕"/>
-          <w:b/>
-          <w:i w:val="0"/>
-          <w:color w:val="007850"/>
-          <w:sz w:val="20"/>
-          <w:rFonts w:eastAsia="Microsoft YaHei" w:ascii="맑은 고딕"/>
-        </w:rPr>
-        <w:t xml:space="preserve">✏️ 예문  </w:t>
-      </w:r>
-      <w:r>
-        <w:rPr>
-          <w:rFonts w:ascii="Microsoft YaHei" w:hAnsi="Microsoft YaHei"/>
-          <w:b/>
-          <w:i w:val="0"/>
-          <w:color w:val="00643C"/>
-          <w:sz w:val="21"/>
-          <w:rFonts w:eastAsia="Microsoft YaHei" w:ascii="Microsoft YaHei"/>
-        </w:rPr>
-        <w:t>如果你对新政策有疑问，可以去人事部咨询。</w:t>
+        <w:t>公司下周将启动一个新的市场推广项目。</w:t>
       </w:r>
     </w:p>
     <w:sectPr>

</xml_diff>